<commit_message>
added screenshots, completed the document
</commit_message>
<xml_diff>
--- a/CMPN 3000.docx
+++ b/CMPN 3000.docx
@@ -3,12 +3,23 @@
 <w:document xmlns:wpc="http://schemas.microsoft.com/office/word/2010/wordprocessingCanvas" xmlns:cx="http://schemas.microsoft.com/office/drawing/2014/chartex" xmlns:cx1="http://schemas.microsoft.com/office/drawing/2015/9/8/chartex" xmlns:cx2="http://schemas.microsoft.com/office/drawing/2015/10/21/chartex" xmlns:cx3="http://schemas.microsoft.com/office/drawing/2016/5/9/chartex" xmlns:cx4="http://schemas.microsoft.com/office/drawing/2016/5/10/chartex" xmlns:cx5="http://schemas.microsoft.com/office/drawing/2016/5/11/chartex" xmlns:cx6="http://schemas.microsoft.com/office/drawing/2016/5/12/chartex" xmlns:cx7="http://schemas.microsoft.com/office/drawing/2016/5/13/chartex" xmlns:cx8="http://schemas.microsoft.com/office/drawing/2016/5/14/chartex" xmlns:mc="http://schemas.openxmlformats.org/markup-compatibility/2006" xmlns:aink="http://schemas.microsoft.com/office/drawing/2016/ink" xmlns:am3d="http://schemas.microsoft.com/office/drawing/2017/model3d" xmlns:o="urn:schemas-microsoft-com:office:office" xmlns:oel="http://schemas.microsoft.com/office/2019/extlst" xmlns:r="http://schemas.openxmlformats.org/officeDocument/2006/relationships" xmlns:m="http://schemas.openxmlformats.org/officeDocument/2006/math" xmlns:v="urn:schemas-microsoft-com:vml" xmlns:wp14="http://schemas.microsoft.com/office/word/2010/wordprocessingDrawing" xmlns:wp="http://schemas.openxmlformats.org/drawingml/2006/wordprocessingDrawing" xmlns:w10="urn:schemas-microsoft-com:office:word" xmlns:w="http://schemas.openxmlformats.org/wordprocessingml/2006/main" xmlns:w14="http://schemas.microsoft.com/office/word/2010/wordml" xmlns:w15="http://schemas.microsoft.com/office/word/2012/wordml" xmlns:w16cex="http://schemas.microsoft.com/office/word/2018/wordml/cex" xmlns:w16cid="http://schemas.microsoft.com/office/word/2016/wordml/cid" xmlns:w16="http://schemas.microsoft.com/office/word/2018/wordml" xmlns:w16du="http://schemas.microsoft.com/office/word/2023/wordml/word16du" xmlns:w16sdtdh="http://schemas.microsoft.com/office/word/2020/wordml/sdtdatahash" xmlns:w16sdtfl="http://schemas.microsoft.com/office/word/2024/wordml/sdtformatlock" xmlns:w16se="http://schemas.microsoft.com/office/word/2015/wordml/symex" xmlns:wpg="http://schemas.microsoft.com/office/word/2010/wordprocessingGroup" xmlns:wpi="http://schemas.microsoft.com/office/word/2010/wordprocessingInk" xmlns:wne="http://schemas.microsoft.com/office/word/2006/wordml" xmlns:wps="http://schemas.microsoft.com/office/word/2010/wordprocessingShape" mc:Ignorable="w14 w15 w16se w16cid w16 w16cex w16sdtdh w16sdtfl w16du wp14">
   <w:body>
     <w:p>
+      <w:pPr>
+        <w:pStyle w:val="Heading2"/>
+      </w:pPr>
+      <w:r>
+        <w:t>Part A: UDP</w:t>
+      </w:r>
+    </w:p>
+    <w:p>
       <w:r>
         <w:t>UDP Traffic screenshot</w:t>
       </w:r>
     </w:p>
     <w:p>
       <w:r>
+        <w:rPr>
+          <w:noProof/>
+        </w:rPr>
         <w:drawing>
           <wp:inline distT="0" distB="0" distL="0" distR="0" wp14:anchorId="47097CAB" wp14:editId="4852D829">
             <wp:extent cx="5943600" cy="1001395"/>
@@ -102,16 +113,24 @@
       </w:r>
     </w:p>
     <w:p>
+      <w:pPr>
+        <w:pStyle w:val="Heading2"/>
+      </w:pPr>
       <w:r>
         <w:lastRenderedPageBreak/>
-        <w:t xml:space="preserve">TCP </w:t>
-      </w:r>
-      <w:r>
-        <w:t>Traffic screenshot</w:t>
-      </w:r>
-    </w:p>
-    <w:p>
-      <w:r>
+        <w:t>Part B: TCP</w:t>
+      </w:r>
+    </w:p>
+    <w:p>
+      <w:r>
+        <w:t>TCP Traffic screenshot</w:t>
+      </w:r>
+    </w:p>
+    <w:p>
+      <w:r>
+        <w:rPr>
+          <w:noProof/>
+        </w:rPr>
         <w:drawing>
           <wp:inline distT="0" distB="0" distL="0" distR="0" wp14:anchorId="7ACDD68F" wp14:editId="5061EE4F">
             <wp:extent cx="5943600" cy="962025"/>
@@ -161,10 +180,7 @@
     </w:p>
     <w:p>
       <w:r>
-        <w:t xml:space="preserve">Protocol: what is the highest-level protocol used, shows </w:t>
-      </w:r>
-      <w:r>
-        <w:t>TCP</w:t>
+        <w:t>Protocol: what is the highest-level protocol used, shows TCP</w:t>
       </w:r>
     </w:p>
     <w:p>
@@ -259,6 +275,246 @@
       </w:pPr>
       <w:r>
         <w:t>Packet 1400: client sends ACK to server to confirm message was received</w:t>
+      </w:r>
+    </w:p>
+    <w:p>
+      <w:r>
+        <w:br w:type="page"/>
+      </w:r>
+    </w:p>
+    <w:p>
+      <w:pPr>
+        <w:pStyle w:val="Heading2"/>
+      </w:pPr>
+      <w:r>
+        <w:lastRenderedPageBreak/>
+        <w:t>Part C: Reflection</w:t>
+      </w:r>
+    </w:p>
+    <w:p>
+      <w:pPr>
+        <w:tabs>
+          <w:tab w:val="center" w:pos="4680"/>
+        </w:tabs>
+      </w:pPr>
+      <w:r>
+        <w:t>Explanation of client interaction</w:t>
+      </w:r>
+    </w:p>
+    <w:p>
+      <w:pPr>
+        <w:pStyle w:val="ListParagraph"/>
+        <w:numPr>
+          <w:ilvl w:val="0"/>
+          <w:numId w:val="3"/>
+        </w:numPr>
+        <w:tabs>
+          <w:tab w:val="center" w:pos="4680"/>
+        </w:tabs>
+      </w:pPr>
+      <w:r>
+        <w:t>UDP just sends messages between the client and server, no connection between them</w:t>
+      </w:r>
+    </w:p>
+    <w:p>
+      <w:pPr>
+        <w:pStyle w:val="ListParagraph"/>
+        <w:numPr>
+          <w:ilvl w:val="0"/>
+          <w:numId w:val="3"/>
+        </w:numPr>
+        <w:tabs>
+          <w:tab w:val="center" w:pos="4680"/>
+        </w:tabs>
+      </w:pPr>
+      <w:r>
+        <w:t>TCP creates a connection between the client and server with a three-way handshake, then sends the messages between the two</w:t>
+      </w:r>
+    </w:p>
+    <w:p>
+      <w:r>
+        <w:t>How do UDP and TCP differ in socket creation and setup</w:t>
+      </w:r>
+    </w:p>
+    <w:p>
+      <w:pPr>
+        <w:pStyle w:val="ListParagraph"/>
+        <w:numPr>
+          <w:ilvl w:val="0"/>
+          <w:numId w:val="3"/>
+        </w:numPr>
+      </w:pPr>
+      <w:r>
+        <w:t xml:space="preserve">UDP uses SOCK_DGRAM and just uses bind() </w:t>
+      </w:r>
+    </w:p>
+    <w:p>
+      <w:pPr>
+        <w:pStyle w:val="ListParagraph"/>
+        <w:numPr>
+          <w:ilvl w:val="0"/>
+          <w:numId w:val="3"/>
+        </w:numPr>
+      </w:pPr>
+      <w:r>
+        <w:t>TCP uses SOCK_STREAM and uses bind(), listen(), and accept() for the connection</w:t>
+      </w:r>
+    </w:p>
+    <w:p>
+      <w:r>
+        <w:t>How do they handle message exchange and delivery</w:t>
+      </w:r>
+    </w:p>
+    <w:p>
+      <w:pPr>
+        <w:pStyle w:val="ListParagraph"/>
+        <w:numPr>
+          <w:ilvl w:val="0"/>
+          <w:numId w:val="3"/>
+        </w:numPr>
+      </w:pPr>
+      <w:r>
+        <w:t>UDP uses sendto and recvfrom</w:t>
+      </w:r>
+    </w:p>
+    <w:p>
+      <w:pPr>
+        <w:pStyle w:val="ListParagraph"/>
+        <w:numPr>
+          <w:ilvl w:val="0"/>
+          <w:numId w:val="3"/>
+        </w:numPr>
+      </w:pPr>
+      <w:r>
+        <w:t>TCP uses send and recv in a stream</w:t>
+      </w:r>
+    </w:p>
+    <w:p>
+      <w:r>
+        <w:t>What debugging or testing challenges did you encounter</w:t>
+      </w:r>
+    </w:p>
+    <w:p>
+      <w:pPr>
+        <w:pStyle w:val="ListParagraph"/>
+        <w:numPr>
+          <w:ilvl w:val="0"/>
+          <w:numId w:val="3"/>
+        </w:numPr>
+      </w:pPr>
+      <w:r>
+        <w:t xml:space="preserve">I used the ‘exit’ case for both, and this was the toughest part to implement as there were times where it did not do what I intended for it to do </w:t>
+      </w:r>
+    </w:p>
+    <w:p>
+      <w:r>
+        <w:t>What are the trade-offs between using TCP and UDP</w:t>
+      </w:r>
+    </w:p>
+    <w:p>
+      <w:pPr>
+        <w:pStyle w:val="ListParagraph"/>
+        <w:numPr>
+          <w:ilvl w:val="0"/>
+          <w:numId w:val="3"/>
+        </w:numPr>
+      </w:pPr>
+      <w:r>
+        <w:t>UDP is more lightweight but does not guarantee delivery of messages</w:t>
+      </w:r>
+    </w:p>
+    <w:p>
+      <w:pPr>
+        <w:pStyle w:val="ListParagraph"/>
+        <w:numPr>
+          <w:ilvl w:val="0"/>
+          <w:numId w:val="3"/>
+        </w:numPr>
+      </w:pPr>
+      <w:r>
+        <w:t>TCP is heavier but provides a secure connection and data stream between the two, which guarantees delivery</w:t>
+      </w:r>
+    </w:p>
+    <w:p>
+      <w:r>
+        <w:t>What basic security risks are present in your implementation</w:t>
+      </w:r>
+    </w:p>
+    <w:p>
+      <w:pPr>
+        <w:pStyle w:val="ListParagraph"/>
+        <w:numPr>
+          <w:ilvl w:val="0"/>
+          <w:numId w:val="3"/>
+        </w:numPr>
+      </w:pPr>
+      <w:r>
+        <w:t>There is no authentication so anyone on my computer can connect</w:t>
+      </w:r>
+    </w:p>
+    <w:p>
+      <w:pPr>
+        <w:pStyle w:val="ListParagraph"/>
+        <w:numPr>
+          <w:ilvl w:val="0"/>
+          <w:numId w:val="3"/>
+        </w:numPr>
+      </w:pPr>
+      <w:r>
+        <w:t>The exit case closes both the client side and server side processes</w:t>
+      </w:r>
+    </w:p>
+    <w:p>
+      <w:pPr>
+        <w:pStyle w:val="ListParagraph"/>
+        <w:numPr>
+          <w:ilvl w:val="0"/>
+          <w:numId w:val="3"/>
+        </w:numPr>
+      </w:pPr>
+      <w:r>
+        <w:t>No encryption so anyone can see the message contents</w:t>
+      </w:r>
+    </w:p>
+    <w:p>
+      <w:r>
+        <w:t>How might you begin to address them in Phase 2</w:t>
+      </w:r>
+    </w:p>
+    <w:p>
+      <w:pPr>
+        <w:pStyle w:val="ListParagraph"/>
+        <w:numPr>
+          <w:ilvl w:val="0"/>
+          <w:numId w:val="3"/>
+        </w:numPr>
+      </w:pPr>
+      <w:r>
+        <w:t>Implement some sort of password or authentication for the connection rather than allowing a connection once the client and server are opened</w:t>
+      </w:r>
+    </w:p>
+    <w:p>
+      <w:pPr>
+        <w:pStyle w:val="ListParagraph"/>
+        <w:numPr>
+          <w:ilvl w:val="0"/>
+          <w:numId w:val="3"/>
+        </w:numPr>
+      </w:pPr>
+      <w:r>
+        <w:t>Edit the code so that the exit case only closes the client and not the server</w:t>
+      </w:r>
+    </w:p>
+    <w:p>
+      <w:pPr>
+        <w:pStyle w:val="ListParagraph"/>
+        <w:numPr>
+          <w:ilvl w:val="0"/>
+          <w:numId w:val="3"/>
+        </w:numPr>
+      </w:pPr>
+      <w:r>
+        <w:t>Use some sort of encryption to hide the message contents when being sent over from one process to the other</w:t>
       </w:r>
     </w:p>
     <w:sectPr>
@@ -451,11 +707,126 @@
       </w:pPr>
     </w:lvl>
   </w:abstractNum>
+  <w:abstractNum w:abstractNumId="2" w15:restartNumberingAfterBreak="0">
+    <w:nsid w:val="7B745626"/>
+    <w:multiLevelType w:val="hybridMultilevel"/>
+    <w:tmpl w:val="1F0E9D4E"/>
+    <w:lvl w:ilvl="0" w:tplc="59E2A150">
+      <w:numFmt w:val="bullet"/>
+      <w:lvlText w:val="-"/>
+      <w:lvlJc w:val="left"/>
+      <w:pPr>
+        <w:ind w:left="720" w:hanging="360"/>
+      </w:pPr>
+      <w:rPr>
+        <w:rFonts w:ascii="Aptos" w:eastAsiaTheme="minorHAnsi" w:hAnsi="Aptos" w:cstheme="minorBidi" w:hint="default"/>
+      </w:rPr>
+    </w:lvl>
+    <w:lvl w:ilvl="1" w:tplc="04090003" w:tentative="1">
+      <w:start w:val="1"/>
+      <w:numFmt w:val="bullet"/>
+      <w:lvlText w:val="o"/>
+      <w:lvlJc w:val="left"/>
+      <w:pPr>
+        <w:ind w:left="1440" w:hanging="360"/>
+      </w:pPr>
+      <w:rPr>
+        <w:rFonts w:ascii="Courier New" w:hAnsi="Courier New" w:cs="Courier New" w:hint="default"/>
+      </w:rPr>
+    </w:lvl>
+    <w:lvl w:ilvl="2" w:tplc="04090005" w:tentative="1">
+      <w:start w:val="1"/>
+      <w:numFmt w:val="bullet"/>
+      <w:lvlText w:val=""/>
+      <w:lvlJc w:val="left"/>
+      <w:pPr>
+        <w:ind w:left="2160" w:hanging="360"/>
+      </w:pPr>
+      <w:rPr>
+        <w:rFonts w:ascii="Wingdings" w:hAnsi="Wingdings" w:hint="default"/>
+      </w:rPr>
+    </w:lvl>
+    <w:lvl w:ilvl="3" w:tplc="04090001" w:tentative="1">
+      <w:start w:val="1"/>
+      <w:numFmt w:val="bullet"/>
+      <w:lvlText w:val=""/>
+      <w:lvlJc w:val="left"/>
+      <w:pPr>
+        <w:ind w:left="2880" w:hanging="360"/>
+      </w:pPr>
+      <w:rPr>
+        <w:rFonts w:ascii="Symbol" w:hAnsi="Symbol" w:hint="default"/>
+      </w:rPr>
+    </w:lvl>
+    <w:lvl w:ilvl="4" w:tplc="04090003" w:tentative="1">
+      <w:start w:val="1"/>
+      <w:numFmt w:val="bullet"/>
+      <w:lvlText w:val="o"/>
+      <w:lvlJc w:val="left"/>
+      <w:pPr>
+        <w:ind w:left="3600" w:hanging="360"/>
+      </w:pPr>
+      <w:rPr>
+        <w:rFonts w:ascii="Courier New" w:hAnsi="Courier New" w:cs="Courier New" w:hint="default"/>
+      </w:rPr>
+    </w:lvl>
+    <w:lvl w:ilvl="5" w:tplc="04090005" w:tentative="1">
+      <w:start w:val="1"/>
+      <w:numFmt w:val="bullet"/>
+      <w:lvlText w:val=""/>
+      <w:lvlJc w:val="left"/>
+      <w:pPr>
+        <w:ind w:left="4320" w:hanging="360"/>
+      </w:pPr>
+      <w:rPr>
+        <w:rFonts w:ascii="Wingdings" w:hAnsi="Wingdings" w:hint="default"/>
+      </w:rPr>
+    </w:lvl>
+    <w:lvl w:ilvl="6" w:tplc="04090001" w:tentative="1">
+      <w:start w:val="1"/>
+      <w:numFmt w:val="bullet"/>
+      <w:lvlText w:val=""/>
+      <w:lvlJc w:val="left"/>
+      <w:pPr>
+        <w:ind w:left="5040" w:hanging="360"/>
+      </w:pPr>
+      <w:rPr>
+        <w:rFonts w:ascii="Symbol" w:hAnsi="Symbol" w:hint="default"/>
+      </w:rPr>
+    </w:lvl>
+    <w:lvl w:ilvl="7" w:tplc="04090003" w:tentative="1">
+      <w:start w:val="1"/>
+      <w:numFmt w:val="bullet"/>
+      <w:lvlText w:val="o"/>
+      <w:lvlJc w:val="left"/>
+      <w:pPr>
+        <w:ind w:left="5760" w:hanging="360"/>
+      </w:pPr>
+      <w:rPr>
+        <w:rFonts w:ascii="Courier New" w:hAnsi="Courier New" w:cs="Courier New" w:hint="default"/>
+      </w:rPr>
+    </w:lvl>
+    <w:lvl w:ilvl="8" w:tplc="04090005" w:tentative="1">
+      <w:start w:val="1"/>
+      <w:numFmt w:val="bullet"/>
+      <w:lvlText w:val=""/>
+      <w:lvlJc w:val="left"/>
+      <w:pPr>
+        <w:ind w:left="6480" w:hanging="360"/>
+      </w:pPr>
+      <w:rPr>
+        <w:rFonts w:ascii="Wingdings" w:hAnsi="Wingdings" w:hint="default"/>
+      </w:rPr>
+    </w:lvl>
+  </w:abstractNum>
   <w:num w:numId="1" w16cid:durableId="17511749">
     <w:abstractNumId w:val="0"/>
   </w:num>
   <w:num w:numId="2" w16cid:durableId="1118647142">
     <w:abstractNumId w:val="1"/>
+  </w:num>
+  <w:num w:numId="3" w16cid:durableId="1921133551">
+    <w:abstractNumId w:val="2"/>
   </w:num>
 </w:numbering>
 </file>
@@ -888,7 +1259,6 @@
     <w:next w:val="Normal"/>
     <w:link w:val="Heading2Char"/>
     <w:uiPriority w:val="9"/>
-    <w:semiHidden/>
     <w:unhideWhenUsed/>
     <w:qFormat/>
     <w:rsid w:val="009E6126"/>
@@ -1105,7 +1475,6 @@
     <w:basedOn w:val="DefaultParagraphFont"/>
     <w:link w:val="Heading2"/>
     <w:uiPriority w:val="9"/>
-    <w:semiHidden/>
     <w:rsid w:val="009E6126"/>
     <w:rPr>
       <w:rFonts w:asciiTheme="majorHAnsi" w:eastAsiaTheme="majorEastAsia" w:hAnsiTheme="majorHAnsi" w:cstheme="majorBidi"/>

</xml_diff>